<commit_message>
Align AHG package with official author guidelines
- Summary: unstructured, <=200 words (179), no abbreviations
- Keywords: 3-6 MeSH terms, alphabetical
- Running title <70 chars; title abbreviation check
- Main-text word-count validation (<=4000, excl. references)
- Funding moved into Acknowledgements; COI heading renamed
- Cover letter EIC 'Dr. Rosemary Ekong'; portal -> Research Exchange
- Checklist: ORCID, MeSH keywords, figure embed rule, portal/email

Co-Authored-By: Tatsuki Onishi <bougtoir@gmail.com>
</commit_message>
<xml_diff>
--- a/denisovan-archaic-dna-analysis/docs/ahg_submission/cover_letter_ahg.docx
+++ b/denisovan-archaic-dna-analysis/docs/ahg_submission/cover_letter_ahg.docx
@@ -4,22 +4,17 @@
   <w:body>
     <w:p>
       <w:r>
-        <w:t>Professor Rosemary Ekong</w:t>
+        <w:t>Dr. Rosemary Ekong</w:t>
       </w:r>
     </w:p>
     <w:p>
       <w:r>
-        <w:t>Editor-in-Chief</w:t>
+        <w:t>Editor-in-Chief, Annals of Human Genetics</w:t>
       </w:r>
     </w:p>
     <w:p>
       <w:r>
-        <w:t>Annals of Human Genetics</w:t>
-      </w:r>
-    </w:p>
-    <w:p>
-      <w:r>
-        <w:t>Wiley / University College London</w:t>
+        <w:t>University College London</w:t>
       </w:r>
     </w:p>
     <w:p/>
@@ -33,7 +28,7 @@
     </w:p>
     <w:p>
       <w:r>
-        <w:t>Dear Professor Rosemary Ekong,</w:t>
+        <w:t>Dear Dr. Rosemary Ekong,</w:t>
       </w:r>
     </w:p>
     <w:p>

</xml_diff>